<commit_message>
Add multi-select lot filters
- Replace the single manzana filter on the CRM lots table with a checkbox dropdown that supports multiple selected blocks.\n- Update the parcelas API to accept repeated manzana parameters and filter exact matches with inArray while leaving free-text search partial.\n- Include the current reservation template and local agent configuration files in this checkpoint as requested.\n\nVerification: pnpm typecheck\n\nCo-authored-by: Codex <codex@openai.com>
</commit_message>
<xml_diff>
--- a/src/templates/reserva-template.docx
+++ b/src/templates/reserva-template.docx
@@ -33,13 +33,21 @@
         <w:t>En la Ciudad de Buenos Aires, a los</w:t>
       </w:r>
       <w:r>
-        <w:t>{dia}</w:t>
+        <w:t>{</w:t>
+      </w:r>
+      <w:proofErr w:type="spellStart"/>
+      <w:r>
+        <w:t>dia</w:t>
+      </w:r>
+      <w:proofErr w:type="spellEnd"/>
+      <w:r>
+        <w:t>}</w:t>
       </w:r>
       <w:r>
         <w:t>días del mes de</w:t>
       </w:r>
       <w:r>
-        <w:t xml:space="preserve">{mes}</w:t>
+        <w:t>{mes}</w:t>
       </w:r>
       <w:r>
         <w:t xml:space="preserve"> de 202</w:t>
@@ -60,19 +68,51 @@
         <w:t xml:space="preserve"> Sr</w:t>
       </w:r>
       <w:r>
-        <w:t>/sra {nombreComprador}</w:t>
+        <w:t>/</w:t>
+      </w:r>
+      <w:proofErr w:type="spellStart"/>
+      <w:r>
+        <w:t>sra</w:t>
+      </w:r>
+      <w:proofErr w:type="spellEnd"/>
+      <w:r>
+        <w:t xml:space="preserve"> {</w:t>
+      </w:r>
+      <w:proofErr w:type="spellStart"/>
+      <w:r>
+        <w:t>nombreComprador</w:t>
+      </w:r>
+      <w:proofErr w:type="spellEnd"/>
+      <w:r>
+        <w:t>}</w:t>
       </w:r>
       <w:r>
         <w:t xml:space="preserve">, DNI </w:t>
       </w:r>
       <w:r>
-        <w:t>{dniComprador}</w:t>
+        <w:t>{</w:t>
+      </w:r>
+      <w:proofErr w:type="spellStart"/>
+      <w:r>
+        <w:t>dniComprador</w:t>
+      </w:r>
+      <w:proofErr w:type="spellEnd"/>
+      <w:r>
+        <w:t>}</w:t>
       </w:r>
       <w:r>
         <w:t xml:space="preserve">, con domicilio en </w:t>
       </w:r>
       <w:r>
-        <w:t>{domicilioComprador}</w:t>
+        <w:t>{</w:t>
+      </w:r>
+      <w:proofErr w:type="spellStart"/>
+      <w:r>
+        <w:t>domicilioComprador</w:t>
+      </w:r>
+      <w:proofErr w:type="spellEnd"/>
+      <w:r>
+        <w:t>}</w:t>
       </w:r>
       <w:r>
         <w:t xml:space="preserve">, en adelante la </w:t>
@@ -98,16 +138,40 @@
         <w:t xml:space="preserve">  </w:t>
       </w:r>
       <w:r>
-        <w:t>{reservaPalabras}</w:t>
+        <w:t>{</w:t>
+      </w:r>
+      <w:proofErr w:type="spellStart"/>
+      <w:r>
+        <w:t>reservaPalabras</w:t>
+      </w:r>
+      <w:proofErr w:type="spellEnd"/>
+      <w:r>
+        <w:t>}</w:t>
       </w:r>
       <w:r>
         <w:t xml:space="preserve"> </w:t>
       </w:r>
       <w:r>
-        <w:t xml:space="preserve">(u$s </w:t>
-      </w:r>
-      <w:r>
-        <w:t>{reservaNum}</w:t>
+        <w:t>(</w:t>
+      </w:r>
+      <w:proofErr w:type="spellStart"/>
+      <w:r>
+        <w:t>u$s</w:t>
+      </w:r>
+      <w:proofErr w:type="spellEnd"/>
+      <w:r>
+        <w:t xml:space="preserve"> </w:t>
+      </w:r>
+      <w:r>
+        <w:t>{</w:t>
+      </w:r>
+      <w:proofErr w:type="spellStart"/>
+      <w:r>
+        <w:t>reservaNum</w:t>
+      </w:r>
+      <w:proofErr w:type="spellEnd"/>
+      <w:r>
+        <w:t>}</w:t>
       </w:r>
       <w:r>
         <w:t>).</w:t>
@@ -177,7 +241,23 @@
           <w:b/>
           <w:bCs/>
         </w:rPr>
-        <w:t>{calleFrente}</w:t>
+        <w:t>{</w:t>
+      </w:r>
+      <w:proofErr w:type="spellStart"/>
+      <w:r>
+        <w:rPr>
+          <w:b/>
+          <w:bCs/>
+        </w:rPr>
+        <w:t>calleFrente</w:t>
+      </w:r>
+      <w:proofErr w:type="spellEnd"/>
+      <w:r>
+        <w:rPr>
+          <w:b/>
+          <w:bCs/>
+        </w:rPr>
+        <w:t>}</w:t>
       </w:r>
       <w:r>
         <w:t xml:space="preserve"> de la </w:t>
@@ -232,13 +312,37 @@
         <w:t xml:space="preserve"> </w:t>
       </w:r>
       <w:r>
-        <w:t>{precioTotalPalabras}</w:t>
-      </w:r>
-      <w:r>
-        <w:t xml:space="preserve"> (u$s </w:t>
-      </w:r>
-      <w:r>
-        <w:t>{precioTotalNum}</w:t>
+        <w:t>{</w:t>
+      </w:r>
+      <w:proofErr w:type="spellStart"/>
+      <w:r>
+        <w:t>precioTotalPalabras</w:t>
+      </w:r>
+      <w:proofErr w:type="spellEnd"/>
+      <w:r>
+        <w:t>}</w:t>
+      </w:r>
+      <w:r>
+        <w:t xml:space="preserve"> (</w:t>
+      </w:r>
+      <w:proofErr w:type="spellStart"/>
+      <w:r>
+        <w:t>u$s</w:t>
+      </w:r>
+      <w:proofErr w:type="spellEnd"/>
+      <w:r>
+        <w:t xml:space="preserve"> </w:t>
+      </w:r>
+      <w:r>
+        <w:t>{</w:t>
+      </w:r>
+      <w:proofErr w:type="spellStart"/>
+      <w:r>
+        <w:t>precioTotalNum</w:t>
+      </w:r>
+      <w:proofErr w:type="spellEnd"/>
+      <w:r>
+        <w:t>}</w:t>
       </w:r>
       <w:r>
         <w:t>).</w:t>
@@ -276,13 +380,37 @@
         <w:t xml:space="preserve"> </w:t>
       </w:r>
       <w:r>
-        <w:t>{anticipoPalabras}</w:t>
-      </w:r>
-      <w:r>
-        <w:t xml:space="preserve"> (u$s </w:t>
-      </w:r>
-      <w:r>
-        <w:t>{anticipoNum}</w:t>
+        <w:t>{</w:t>
+      </w:r>
+      <w:proofErr w:type="spellStart"/>
+      <w:r>
+        <w:t>anticipoPalabras</w:t>
+      </w:r>
+      <w:proofErr w:type="spellEnd"/>
+      <w:r>
+        <w:t>}</w:t>
+      </w:r>
+      <w:r>
+        <w:t xml:space="preserve"> (</w:t>
+      </w:r>
+      <w:proofErr w:type="spellStart"/>
+      <w:r>
+        <w:t>u$s</w:t>
+      </w:r>
+      <w:proofErr w:type="spellEnd"/>
+      <w:r>
+        <w:t xml:space="preserve"> </w:t>
+      </w:r>
+      <w:r>
+        <w:t>{</w:t>
+      </w:r>
+      <w:proofErr w:type="spellStart"/>
+      <w:r>
+        <w:t>anticipoNum</w:t>
+      </w:r>
+      <w:proofErr w:type="spellEnd"/>
+      <w:r>
+        <w:t>}</w:t>
       </w:r>
       <w:r>
         <w:t>) se entregará como anticipo a cuenta de precio, el día de la firma del boleto de compraventa, con un máximo</w:t>
@@ -329,25 +457,51 @@
         <w:t xml:space="preserve"> </w:t>
       </w:r>
       <w:r>
-        <w:t>{saldoPalabras}</w:t>
-      </w:r>
+        <w:t>{</w:t>
+      </w:r>
+      <w:proofErr w:type="spellStart"/>
+      <w:r>
+        <w:t>saldoPalabras</w:t>
+      </w:r>
+      <w:proofErr w:type="spellEnd"/>
+      <w:r>
+        <w:t>}</w:t>
+      </w:r>
+      <w:r>
+        <w:t xml:space="preserve"> (</w:t>
+      </w:r>
+      <w:proofErr w:type="spellStart"/>
+      <w:r>
+        <w:t>u$s</w:t>
+      </w:r>
+      <w:proofErr w:type="spellEnd"/>
       <w:r>
         <w:t xml:space="preserve"> </w:t>
       </w:r>
       <w:r>
-        <w:t xml:space="preserve"/>
-      </w:r>
-      <w:r>
-        <w:t xml:space="preserve">(u$s </w:t>
-      </w:r>
-      <w:r>
-        <w:t>{saldoNum}</w:t>
+        <w:t>{</w:t>
+      </w:r>
+      <w:proofErr w:type="spellStart"/>
+      <w:r>
+        <w:t>saldoNum</w:t>
+      </w:r>
+      <w:proofErr w:type="spellEnd"/>
+      <w:r>
+        <w:t>}</w:t>
       </w:r>
       <w:r>
         <w:t xml:space="preserve">) será abonada por la PARTE OFERENTE en </w:t>
       </w:r>
       <w:r>
-        <w:t>{cantidadCuotas}</w:t>
+        <w:t>{</w:t>
+      </w:r>
+      <w:proofErr w:type="spellStart"/>
+      <w:r>
+        <w:t>cantidadCuotas</w:t>
+      </w:r>
+      <w:proofErr w:type="spellEnd"/>
+      <w:r>
+        <w:t>}</w:t>
       </w:r>
       <w:r>
         <w:t xml:space="preserve"> Cuotas, iguales mensuales </w:t>
@@ -372,22 +526,40 @@
         <w:t xml:space="preserve"> </w:t>
       </w:r>
       <w:r>
-        <w:t>{cuotaMensualPalabras}</w:t>
+        <w:t>{</w:t>
+      </w:r>
+      <w:proofErr w:type="spellStart"/>
+      <w:r>
+        <w:t>cuotaMensualPalabras</w:t>
+      </w:r>
+      <w:proofErr w:type="spellEnd"/>
+      <w:r>
+        <w:t>}</w:t>
       </w:r>
       <w:r>
         <w:t xml:space="preserve"> </w:t>
       </w:r>
       <w:r>
-        <w:t xml:space="preserve"/>
-      </w:r>
-      <w:r>
         <w:t>(</w:t>
       </w:r>
-      <w:r>
-        <w:t xml:space="preserve">u$s </w:t>
-      </w:r>
-      <w:r>
-        <w:t>{cuotaMensual}</w:t>
+      <w:proofErr w:type="spellStart"/>
+      <w:r>
+        <w:t>u$s</w:t>
+      </w:r>
+      <w:proofErr w:type="spellEnd"/>
+      <w:r>
+        <w:t xml:space="preserve"> </w:t>
+      </w:r>
+      <w:r>
+        <w:t>{</w:t>
+      </w:r>
+      <w:proofErr w:type="spellStart"/>
+      <w:r>
+        <w:t>cuotaMensual</w:t>
+      </w:r>
+      <w:proofErr w:type="spellEnd"/>
+      <w:r>
+        <w:t>}</w:t>
       </w:r>
       <w:r>
         <w:t>) al momento de la firma del Boleto de Compraventa.</w:t>
@@ -551,10 +723,26 @@
         <w:t>SEXTA: POSESIÓN</w:t>
       </w:r>
       <w:r>
-        <w:t xml:space="preserve">: La posesión real, legal y material del inmueble objeto de la presente se entregará a la PARTE COMPRADORA al momento de obtener el recibo de pago de la cuota numero  </w:t>
-      </w:r>
-      <w:r>
-        <w:t>{numeroCuotaEntrega}</w:t>
+        <w:t xml:space="preserve">: La posesión real, legal y material del inmueble objeto de la presente se entregará a la PARTE COMPRADORA al momento de obtener el recibo de pago de la cuota </w:t>
+      </w:r>
+      <w:proofErr w:type="spellStart"/>
+      <w:r>
+        <w:t>numero</w:t>
+      </w:r>
+      <w:proofErr w:type="spellEnd"/>
+      <w:r>
+        <w:t xml:space="preserve">  </w:t>
+      </w:r>
+      <w:r>
+        <w:t>{</w:t>
+      </w:r>
+      <w:proofErr w:type="spellStart"/>
+      <w:r>
+        <w:t>numeroCuotaEntrega</w:t>
+      </w:r>
+      <w:proofErr w:type="spellEnd"/>
+      <w:r>
+        <w:t>}</w:t>
       </w:r>
       <w:r>
         <w:t xml:space="preserve"> El lote se entregará totalmente desocupado, libre de inquilinos, ocupantes y/o intrusos. En ese acto se labrara un documento de entrega y a partir de la toma de posesión, todos los gastos por impuestos, tasas, contribuciones y expensas (si correspondieran) serán a cargo exclusivo de la PARTE COMPRADORA.</w:t>
@@ -566,7 +754,21 @@
           <w:b/>
           <w:bCs/>
         </w:rPr>
-        <w:t>SEXTA: HONORARIOS INMOBILIARIOS.</w:t>
+        <w:t xml:space="preserve">SEXTA: </w:t>
+      </w:r>
+      <w:r>
+        <w:rPr>
+          <w:b/>
+          <w:bCs/>
+        </w:rPr>
+        <w:t xml:space="preserve">GASTOS Y </w:t>
+      </w:r>
+      <w:r>
+        <w:rPr>
+          <w:b/>
+          <w:bCs/>
+        </w:rPr>
+        <w:t>HONORARIOS.</w:t>
       </w:r>
       <w:r>
         <w:t xml:space="preserve"> La PARTE OFERENTE reconoce la intermediación</w:t>
@@ -578,7 +780,15 @@
         <w:t xml:space="preserve"> </w:t>
       </w:r>
       <w:r>
-        <w:t>{nombreCorredor}</w:t>
+        <w:t>{</w:t>
+      </w:r>
+      <w:proofErr w:type="spellStart"/>
+      <w:r>
+        <w:t>nombreCorredor</w:t>
+      </w:r>
+      <w:proofErr w:type="spellEnd"/>
+      <w:r>
+        <w:t>}</w:t>
       </w:r>
       <w:r>
         <w:t xml:space="preserve"> y se obliga a abonar en concepto de honorarios la suma </w:t>
@@ -588,30 +798,52 @@
           <w:b/>
           <w:bCs/>
         </w:rPr>
-        <w:t xml:space="preserve">DÓLARES </w:t>
-      </w:r>
-      <w:r>
-        <w:rPr>
-          <w:b/>
-          <w:bCs/>
-        </w:rPr>
-        <w:lastRenderedPageBreak/>
-        <w:t>ESTADOUNIDENSES BILLETE</w:t>
+        <w:t>DÓLARES ESTADOUNIDENSES BILLETE</w:t>
       </w:r>
       <w:r>
         <w:t xml:space="preserve"> </w:t>
       </w:r>
       <w:r>
-        <w:t>{honorariosPalabras}</w:t>
-      </w:r>
-      <w:r>
-        <w:t xml:space="preserve">. (u$s </w:t>
-      </w:r>
-      <w:r>
-        <w:t>{honorariosNum}</w:t>
-      </w:r>
-      <w:r>
-        <w:t>)  del monto total de la operación al momento de la firma del Boleto de Compraventa.</w:t>
+        <w:t>{</w:t>
+      </w:r>
+      <w:proofErr w:type="spellStart"/>
+      <w:r>
+        <w:t>honorariosPalabras</w:t>
+      </w:r>
+      <w:proofErr w:type="spellEnd"/>
+      <w:r>
+        <w:t>}</w:t>
+      </w:r>
+      <w:r>
+        <w:t>. (</w:t>
+      </w:r>
+      <w:proofErr w:type="spellStart"/>
+      <w:r>
+        <w:t>u$s</w:t>
+      </w:r>
+      <w:proofErr w:type="spellEnd"/>
+      <w:r>
+        <w:t xml:space="preserve"> </w:t>
+      </w:r>
+      <w:r>
+        <w:t>{</w:t>
+      </w:r>
+      <w:proofErr w:type="spellStart"/>
+      <w:r>
+        <w:t>honorariosNum</w:t>
+      </w:r>
+      <w:proofErr w:type="spellEnd"/>
+      <w:r>
+        <w:t>}</w:t>
+      </w:r>
+      <w:r>
+        <w:t xml:space="preserve">) </w:t>
+      </w:r>
+      <w:r>
+        <w:t>a</w:t>
+      </w:r>
+      <w:r>
+        <w:t>l momento de la firma del Boleto de Compraventa.</w:t>
       </w:r>
     </w:p>
     <w:p>
@@ -620,6 +852,7 @@
           <w:b/>
           <w:bCs/>
         </w:rPr>
+        <w:lastRenderedPageBreak/>
         <w:t>FIRMAS</w:t>
       </w:r>
       <w:r>
@@ -654,11 +887,26 @@
       </w:r>
       <w:r>
         <w:br/>
-        <w:t>Reservante / oferente / comprador</w:t>
+      </w:r>
+      <w:proofErr w:type="spellStart"/>
+      <w:r>
+        <w:t>Reservante</w:t>
+      </w:r>
+      <w:proofErr w:type="spellEnd"/>
+      <w:r>
+        <w:t xml:space="preserve"> / oferente / comprador</w:t>
       </w:r>
       <w:r>
         <w:br/>
-        <w:t>DNI: {dniComprador}</w:t>
+        <w:t>DNI: {</w:t>
+      </w:r>
+      <w:proofErr w:type="spellStart"/>
+      <w:r>
+        <w:t>dniComprador</w:t>
+      </w:r>
+      <w:proofErr w:type="spellEnd"/>
+      <w:r>
+        <w:t>}</w:t>
       </w:r>
     </w:p>
     <w:p>
@@ -683,15 +931,39 @@
       </w:r>
       <w:r>
         <w:br/>
-        <w:t xml:space="preserve">Broker: {nombreCorredor}</w:t>
+        <w:t>Broker: {</w:t>
+      </w:r>
+      <w:proofErr w:type="spellStart"/>
+      <w:r>
+        <w:t>nombreCorredor</w:t>
+      </w:r>
+      <w:proofErr w:type="spellEnd"/>
+      <w:r>
+        <w:t>}</w:t>
       </w:r>
       <w:r>
         <w:br/>
-        <w:t>DNI: {dniCorredor}</w:t>
+        <w:t>DNI: {</w:t>
+      </w:r>
+      <w:proofErr w:type="spellStart"/>
+      <w:r>
+        <w:t>dniCorredor</w:t>
+      </w:r>
+      <w:proofErr w:type="spellEnd"/>
+      <w:r>
+        <w:t>}</w:t>
       </w:r>
       <w:r>
         <w:br/>
-        <w:t>(Recibi la suma  arriba mencionada en conformidad)</w:t>
+        <w:t>(</w:t>
+      </w:r>
+      <w:proofErr w:type="spellStart"/>
+      <w:r>
+        <w:t>Recibi</w:t>
+      </w:r>
+      <w:proofErr w:type="spellEnd"/>
+      <w:r>
+        <w:t xml:space="preserve"> la suma  arriba mencionada en conformidad)</w:t>
       </w:r>
     </w:p>
     <w:p>
@@ -739,7 +1011,7 @@
         <w:t>MIGUEL ANGEL LAZZARO</w:t>
       </w:r>
       <w:r>
-        <w:t>, manifiesto la total aceptación de la presente oferta de compra en los términos y condiciones aquí expresados. </w:t>
+        <w:t>, manifiesto la total aceptación de la presente oferta de compra en los términos y condiciones aquí expresados.</w:t>
       </w:r>
     </w:p>
     <w:p>

</xml_diff>